<commit_message>
PHY 118 Lab 03: lighter report starter, corrected Note 4 reference, Letter-size print
- Report starter rebuilt with reduced scaffolding: four trailing sentence
  openers (Abstract, Results, Discussion, Conclusion) in place of Lab 02's
  full set, and the subtitle corrected to College Physics I.
- Lab page: the angled-launch pointer no longer names "Note 4", which PHY 118
  does not have; it now links the converted decks M2_Ch04b and M2_Ch04c.
- Lab PDF reprinted from Chromium at Letter. The previous print was WeasyPrint
  at A4, out of step with every other handout in the program.

Co-Authored-By: Claude Opus 5 <noreply@anthropic.com>
Claude-Session: https://claude.ai/code/session_018MqKvA85cwuY7VgHFbbmQo
</commit_message>
<xml_diff>
--- a/PHY118/handouts/PHY118_LB03_Projectile_Motion_Example_Starter.docx
+++ b/PHY118/handouts/PHY118_LB03_Projectile_Motion_Example_Starter.docx
@@ -37,7 +37,7 @@
           <w:sz w:val="20"/>
           <w:szCs w:val="20"/>
         </w:rPr>
-        <w:t xml:space="preserve">PHY 118 · University Physics I · Lab 3</w:t>
+        <w:t xml:space="preserve">PHY 118 · College Physics I · Lab 3</w:t>
       </w:r>
     </w:p>
     <w:p>
@@ -79,27 +79,6 @@
     </w:p>
     <w:p>
       <w:pPr>
-        <w:pBdr>
-          <w:bottom w:val="single" w:color="CFE0D6" w:sz="6" w:space="4"/>
-        </w:pBdr>
-        <w:spacing w:after="120" w:before="280"/>
-      </w:pPr>
-      <w:r>
-        <w:rPr>
-          <w:rFonts w:ascii="Calibri" w:cs="Calibri" w:eastAsia="Calibri" w:hAnsi="Calibri"/>
-          <w:b/>
-          <w:bCs/>
-          <w:i w:val="false"/>
-          <w:iCs w:val="false"/>
-          <w:color w:val="1F4E3D"/>
-          <w:sz w:val="26"/>
-          <w:szCs w:val="26"/>
-        </w:rPr>
-        <w:t xml:space="preserve">Abstract</w:t>
-      </w:r>
-    </w:p>
-    <w:p>
-      <w:pPr>
         <w:spacing w:after="160" w:before="0"/>
       </w:pPr>
       <w:r>
@@ -113,61 +92,7 @@
           <w:sz w:val="19"/>
           <w:szCs w:val="19"/>
         </w:rPr>
-        <w:t xml:space="preserve">Four sentences or fewer, written last. What you measured; the launch speed with its uncertainty; the percent differences across your heights; whether the prediction held. No method detail, no background.</w:t>
-      </w:r>
-    </w:p>
-    <w:p>
-      <w:pPr>
-        <w:spacing w:after="0" w:before="0" w:line="360"/>
-      </w:pPr>
-      <w:r>
-        <w:rPr>
-          <w:rFonts w:ascii="Calibri" w:cs="Calibri" w:eastAsia="Calibri" w:hAnsi="Calibri"/>
-          <w:b w:val="false"/>
-          <w:bCs w:val="false"/>
-          <w:i w:val="false"/>
-          <w:iCs w:val="false"/>
-          <w:color w:val="262626"/>
-          <w:sz w:val="22"/>
-          <w:szCs w:val="22"/>
-        </w:rPr>
-        <w:t xml:space="preserve"/>
-      </w:r>
-    </w:p>
-    <w:p>
-      <w:pPr>
-        <w:spacing w:after="0" w:before="0" w:line="360"/>
-      </w:pPr>
-      <w:r>
-        <w:rPr>
-          <w:rFonts w:ascii="Calibri" w:cs="Calibri" w:eastAsia="Calibri" w:hAnsi="Calibri"/>
-          <w:b w:val="false"/>
-          <w:bCs w:val="false"/>
-          <w:i w:val="false"/>
-          <w:iCs w:val="false"/>
-          <w:color w:val="262626"/>
-          <w:sz w:val="22"/>
-          <w:szCs w:val="22"/>
-        </w:rPr>
-        <w:t xml:space="preserve"/>
-      </w:r>
-    </w:p>
-    <w:p>
-      <w:pPr>
-        <w:spacing w:after="0" w:before="0" w:line="360"/>
-      </w:pPr>
-      <w:r>
-        <w:rPr>
-          <w:rFonts w:ascii="Calibri" w:cs="Calibri" w:eastAsia="Calibri" w:hAnsi="Calibri"/>
-          <w:b w:val="false"/>
-          <w:bCs w:val="false"/>
-          <w:i w:val="false"/>
-          <w:iCs w:val="false"/>
-          <w:color w:val="262626"/>
-          <w:sz w:val="22"/>
-          <w:szCs w:val="22"/>
-        </w:rPr>
-        <w:t xml:space="preserve"/>
+        <w:t xml:space="preserve">One change from Lab 2. That starter wrote the opening sentence of every section for you. This one writes four — only the four the rubric names by wording — and each stops at ……, which is where your sentence begins. Everything else is yours from the first word. Delete the …… once you have finished the sentence. By Lab 5 these four go too.</w:t>
       </w:r>
     </w:p>
     <w:p>
@@ -188,7 +113,7 @@
           <w:sz w:val="26"/>
           <w:szCs w:val="26"/>
         </w:rPr>
-        <w:t xml:space="preserve">Introduction</w:t>
+        <w:t xml:space="preserve">Abstract</w:t>
       </w:r>
     </w:p>
     <w:p>
@@ -206,113 +131,100 @@
           <w:sz w:val="19"/>
           <w:szCs w:val="19"/>
         </w:rPr>
-        <w:t xml:space="preserve">Derive the working equation yourself, line by line. Do not quote it. Start from the two axis equations and eliminate the shared time.</w:t>
-      </w:r>
-    </w:p>
-    <w:p>
-      <w:pPr>
-        <w:spacing w:after="160" w:before="120"/>
-        <w:jc w:val="center"/>
-      </w:pPr>
-      <w:r>
-        <w:rPr>
-          <w:rFonts w:ascii="Calibri" w:cs="Calibri" w:eastAsia="Calibri" w:hAnsi="Calibri"/>
-          <w:b w:val="false"/>
-          <w:bCs w:val="false"/>
-          <w:i w:val="false"/>
-          <w:iCs w:val="false"/>
-          <w:color w:val="262626"/>
-          <w:sz w:val="22"/>
-          <w:szCs w:val="22"/>
-        </w:rPr>
-        <w:t xml:space="preserve">horizontal:   d = v</w:t>
-      </w:r>
-      <w:r>
-        <w:rPr>
-          <w:rFonts w:ascii="Calibri" w:cs="Calibri" w:eastAsia="Calibri" w:hAnsi="Calibri"/>
-          <w:b w:val="false"/>
-          <w:bCs w:val="false"/>
-          <w:i w:val="false"/>
-          <w:iCs w:val="false"/>
-          <w:color w:val="262626"/>
-          <w:sz w:val="22"/>
-          <w:szCs w:val="22"/>
-          <w:vertAlign w:val="subscript"/>
-        </w:rPr>
-        <w:t xml:space="preserve">0</w:t>
-      </w:r>
-      <w:r>
-        <w:rPr>
-          <w:rFonts w:ascii="Calibri" w:cs="Calibri" w:eastAsia="Calibri" w:hAnsi="Calibri"/>
-          <w:b w:val="false"/>
-          <w:bCs w:val="false"/>
-          <w:i w:val="false"/>
-          <w:iCs w:val="false"/>
-          <w:color w:val="262626"/>
-          <w:sz w:val="22"/>
-          <w:szCs w:val="22"/>
-        </w:rPr>
-        <w:t xml:space="preserve"> t          vertical:   h = ½ g t</w:t>
-      </w:r>
-      <w:r>
-        <w:rPr>
-          <w:rFonts w:ascii="Calibri" w:cs="Calibri" w:eastAsia="Calibri" w:hAnsi="Calibri"/>
-          <w:b w:val="false"/>
-          <w:bCs w:val="false"/>
-          <w:i w:val="false"/>
-          <w:iCs w:val="false"/>
-          <w:color w:val="262626"/>
-          <w:sz w:val="22"/>
-          <w:szCs w:val="22"/>
-          <w:vertAlign w:val="superscript"/>
-        </w:rPr>
-        <w:t xml:space="preserve">2</w:t>
-      </w:r>
-    </w:p>
-    <w:p>
-      <w:pPr>
-        <w:spacing w:after="160" w:before="120"/>
-        <w:jc w:val="center"/>
-      </w:pPr>
-      <w:r>
-        <w:rPr>
-          <w:rFonts w:ascii="Calibri" w:cs="Calibri" w:eastAsia="Calibri" w:hAnsi="Calibri"/>
-          <w:b w:val="false"/>
-          <w:bCs w:val="false"/>
-          <w:i w:val="false"/>
-          <w:iCs w:val="false"/>
-          <w:color w:val="262626"/>
-          <w:sz w:val="22"/>
-          <w:szCs w:val="22"/>
-        </w:rPr>
-        <w:t xml:space="preserve">t = √(2h / g)     →     d = v</w:t>
-      </w:r>
-      <w:r>
-        <w:rPr>
-          <w:rFonts w:ascii="Calibri" w:cs="Calibri" w:eastAsia="Calibri" w:hAnsi="Calibri"/>
-          <w:b w:val="false"/>
-          <w:bCs w:val="false"/>
-          <w:i w:val="false"/>
-          <w:iCs w:val="false"/>
-          <w:color w:val="262626"/>
-          <w:sz w:val="22"/>
-          <w:szCs w:val="22"/>
-          <w:vertAlign w:val="subscript"/>
-        </w:rPr>
-        <w:t xml:space="preserve">0</w:t>
-      </w:r>
-      <w:r>
-        <w:rPr>
-          <w:rFonts w:ascii="Calibri" w:cs="Calibri" w:eastAsia="Calibri" w:hAnsi="Calibri"/>
-          <w:b w:val="false"/>
-          <w:bCs w:val="false"/>
-          <w:i w:val="false"/>
-          <w:iCs w:val="false"/>
-          <w:color w:val="262626"/>
-          <w:sz w:val="22"/>
-          <w:szCs w:val="22"/>
-        </w:rPr>
-        <w:t xml:space="preserve"> √(2h / g)</w:t>
+        <w:t xml:space="preserve">Four sentences or fewer, written last. What you measured; the launch speed with its uncertainty; the percent differences across your heights; whether the prediction held. No method detail, no background.</w:t>
+      </w:r>
+    </w:p>
+    <w:p>
+      <w:pPr>
+        <w:spacing w:after="160" w:before="0"/>
+      </w:pPr>
+      <w:r>
+        <w:rPr>
+          <w:rFonts w:ascii="Calibri" w:cs="Calibri" w:eastAsia="Calibri" w:hAnsi="Calibri"/>
+          <w:b w:val="false"/>
+          <w:bCs w:val="false"/>
+          <w:i w:val="false"/>
+          <w:iCs w:val="false"/>
+          <w:color w:val="262626"/>
+          <w:sz w:val="22"/>
+          <w:szCs w:val="22"/>
+        </w:rPr>
+        <w:t xml:space="preserve">We determined the launch speed of a horizontally fired ball to be v₀ = ___ ± ___ m/s, and used it to predict ……</w:t>
+      </w:r>
+    </w:p>
+    <w:p>
+      <w:pPr>
+        <w:spacing w:after="0" w:before="0" w:line="360"/>
+      </w:pPr>
+      <w:r>
+        <w:rPr>
+          <w:rFonts w:ascii="Calibri" w:cs="Calibri" w:eastAsia="Calibri" w:hAnsi="Calibri"/>
+          <w:b w:val="false"/>
+          <w:bCs w:val="false"/>
+          <w:i w:val="false"/>
+          <w:iCs w:val="false"/>
+          <w:color w:val="262626"/>
+          <w:sz w:val="22"/>
+          <w:szCs w:val="22"/>
+        </w:rPr>
+        <w:t xml:space="preserve"/>
+      </w:r>
+    </w:p>
+    <w:p>
+      <w:pPr>
+        <w:spacing w:after="0" w:before="0" w:line="360"/>
+      </w:pPr>
+      <w:r>
+        <w:rPr>
+          <w:rFonts w:ascii="Calibri" w:cs="Calibri" w:eastAsia="Calibri" w:hAnsi="Calibri"/>
+          <w:b w:val="false"/>
+          <w:bCs w:val="false"/>
+          <w:i w:val="false"/>
+          <w:iCs w:val="false"/>
+          <w:color w:val="262626"/>
+          <w:sz w:val="22"/>
+          <w:szCs w:val="22"/>
+        </w:rPr>
+        <w:t xml:space="preserve"/>
+      </w:r>
+    </w:p>
+    <w:p>
+      <w:pPr>
+        <w:spacing w:after="0" w:before="0" w:line="360"/>
+      </w:pPr>
+      <w:r>
+        <w:rPr>
+          <w:rFonts w:ascii="Calibri" w:cs="Calibri" w:eastAsia="Calibri" w:hAnsi="Calibri"/>
+          <w:b w:val="false"/>
+          <w:bCs w:val="false"/>
+          <w:i w:val="false"/>
+          <w:iCs w:val="false"/>
+          <w:color w:val="262626"/>
+          <w:sz w:val="22"/>
+          <w:szCs w:val="22"/>
+        </w:rPr>
+        <w:t xml:space="preserve"/>
+      </w:r>
+    </w:p>
+    <w:p>
+      <w:pPr>
+        <w:pBdr>
+          <w:bottom w:val="single" w:color="CFE0D6" w:sz="6" w:space="4"/>
+        </w:pBdr>
+        <w:spacing w:after="120" w:before="280"/>
+      </w:pPr>
+      <w:r>
+        <w:rPr>
+          <w:rFonts w:ascii="Calibri" w:cs="Calibri" w:eastAsia="Calibri" w:hAnsi="Calibri"/>
+          <w:b/>
+          <w:bCs/>
+          <w:i w:val="false"/>
+          <w:iCs w:val="false"/>
+          <w:color w:val="1F4E3D"/>
+          <w:sz w:val="26"/>
+          <w:szCs w:val="26"/>
+        </w:rPr>
+        <w:t xml:space="preserve">Introduction</w:t>
       </w:r>
     </w:p>
     <w:p>
@@ -330,100 +242,113 @@
           <w:sz w:val="19"/>
           <w:szCs w:val="19"/>
         </w:rPr>
-        <w:t xml:space="preserve">Define every variable. State the sign convention you are using (up positive, a = −g, g = 9.80 m/s² as a magnitude). Then state a hypothesis you can confirm or reject at the end — something the data can actually settle.</w:t>
-      </w:r>
-    </w:p>
-    <w:p>
-      <w:pPr>
-        <w:spacing w:after="0" w:before="0" w:line="360"/>
-      </w:pPr>
-      <w:r>
-        <w:rPr>
-          <w:rFonts w:ascii="Calibri" w:cs="Calibri" w:eastAsia="Calibri" w:hAnsi="Calibri"/>
-          <w:b w:val="false"/>
-          <w:bCs w:val="false"/>
-          <w:i w:val="false"/>
-          <w:iCs w:val="false"/>
-          <w:color w:val="262626"/>
-          <w:sz w:val="22"/>
-          <w:szCs w:val="22"/>
-        </w:rPr>
-        <w:t xml:space="preserve"/>
-      </w:r>
-    </w:p>
-    <w:p>
-      <w:pPr>
-        <w:spacing w:after="0" w:before="0" w:line="360"/>
-      </w:pPr>
-      <w:r>
-        <w:rPr>
-          <w:rFonts w:ascii="Calibri" w:cs="Calibri" w:eastAsia="Calibri" w:hAnsi="Calibri"/>
-          <w:b w:val="false"/>
-          <w:bCs w:val="false"/>
-          <w:i w:val="false"/>
-          <w:iCs w:val="false"/>
-          <w:color w:val="262626"/>
-          <w:sz w:val="22"/>
-          <w:szCs w:val="22"/>
-        </w:rPr>
-        <w:t xml:space="preserve"/>
-      </w:r>
-    </w:p>
-    <w:p>
-      <w:pPr>
-        <w:spacing w:after="0" w:before="0" w:line="360"/>
-      </w:pPr>
-      <w:r>
-        <w:rPr>
-          <w:rFonts w:ascii="Calibri" w:cs="Calibri" w:eastAsia="Calibri" w:hAnsi="Calibri"/>
-          <w:b w:val="false"/>
-          <w:bCs w:val="false"/>
-          <w:i w:val="false"/>
-          <w:iCs w:val="false"/>
-          <w:color w:val="262626"/>
-          <w:sz w:val="22"/>
-          <w:szCs w:val="22"/>
-        </w:rPr>
-        <w:t xml:space="preserve"/>
-      </w:r>
-    </w:p>
-    <w:p>
-      <w:pPr>
-        <w:spacing w:after="0" w:before="0" w:line="360"/>
-      </w:pPr>
-      <w:r>
-        <w:rPr>
-          <w:rFonts w:ascii="Calibri" w:cs="Calibri" w:eastAsia="Calibri" w:hAnsi="Calibri"/>
-          <w:b w:val="false"/>
-          <w:bCs w:val="false"/>
-          <w:i w:val="false"/>
-          <w:iCs w:val="false"/>
-          <w:color w:val="262626"/>
-          <w:sz w:val="22"/>
-          <w:szCs w:val="22"/>
-        </w:rPr>
-        <w:t xml:space="preserve"/>
-      </w:r>
-    </w:p>
-    <w:p>
-      <w:pPr>
-        <w:pBdr>
-          <w:bottom w:val="single" w:color="CFE0D6" w:sz="6" w:space="4"/>
-        </w:pBdr>
-        <w:spacing w:after="120" w:before="280"/>
-      </w:pPr>
-      <w:r>
-        <w:rPr>
-          <w:rFonts w:ascii="Calibri" w:cs="Calibri" w:eastAsia="Calibri" w:hAnsi="Calibri"/>
-          <w:b/>
-          <w:bCs/>
-          <w:i w:val="false"/>
-          <w:iCs w:val="false"/>
-          <w:color w:val="1F4E3D"/>
-          <w:sz w:val="26"/>
-          <w:szCs w:val="26"/>
-        </w:rPr>
-        <w:t xml:space="preserve">Experimental: Materials and Setup</w:t>
+        <w:t xml:space="preserve">Derive the working equation yourself, line by line. Do not quote it. Start from the two axis equations and eliminate the shared time.</w:t>
+      </w:r>
+    </w:p>
+    <w:p>
+      <w:pPr>
+        <w:spacing w:after="160" w:before="120"/>
+        <w:jc w:val="center"/>
+      </w:pPr>
+      <w:r>
+        <w:rPr>
+          <w:rFonts w:ascii="Calibri" w:cs="Calibri" w:eastAsia="Calibri" w:hAnsi="Calibri"/>
+          <w:b w:val="false"/>
+          <w:bCs w:val="false"/>
+          <w:i w:val="false"/>
+          <w:iCs w:val="false"/>
+          <w:color w:val="262626"/>
+          <w:sz w:val="22"/>
+          <w:szCs w:val="22"/>
+        </w:rPr>
+        <w:t xml:space="preserve">horizontal:   d = v</w:t>
+      </w:r>
+      <w:r>
+        <w:rPr>
+          <w:rFonts w:ascii="Calibri" w:cs="Calibri" w:eastAsia="Calibri" w:hAnsi="Calibri"/>
+          <w:b w:val="false"/>
+          <w:bCs w:val="false"/>
+          <w:i w:val="false"/>
+          <w:iCs w:val="false"/>
+          <w:color w:val="262626"/>
+          <w:sz w:val="22"/>
+          <w:szCs w:val="22"/>
+          <w:vertAlign w:val="subscript"/>
+        </w:rPr>
+        <w:t xml:space="preserve">0</w:t>
+      </w:r>
+      <w:r>
+        <w:rPr>
+          <w:rFonts w:ascii="Calibri" w:cs="Calibri" w:eastAsia="Calibri" w:hAnsi="Calibri"/>
+          <w:b w:val="false"/>
+          <w:bCs w:val="false"/>
+          <w:i w:val="false"/>
+          <w:iCs w:val="false"/>
+          <w:color w:val="262626"/>
+          <w:sz w:val="22"/>
+          <w:szCs w:val="22"/>
+        </w:rPr>
+        <w:t xml:space="preserve"> t          vertical:   h = ½ g t</w:t>
+      </w:r>
+      <w:r>
+        <w:rPr>
+          <w:rFonts w:ascii="Calibri" w:cs="Calibri" w:eastAsia="Calibri" w:hAnsi="Calibri"/>
+          <w:b w:val="false"/>
+          <w:bCs w:val="false"/>
+          <w:i w:val="false"/>
+          <w:iCs w:val="false"/>
+          <w:color w:val="262626"/>
+          <w:sz w:val="22"/>
+          <w:szCs w:val="22"/>
+          <w:vertAlign w:val="superscript"/>
+        </w:rPr>
+        <w:t xml:space="preserve">2</w:t>
+      </w:r>
+    </w:p>
+    <w:p>
+      <w:pPr>
+        <w:spacing w:after="160" w:before="120"/>
+        <w:jc w:val="center"/>
+      </w:pPr>
+      <w:r>
+        <w:rPr>
+          <w:rFonts w:ascii="Calibri" w:cs="Calibri" w:eastAsia="Calibri" w:hAnsi="Calibri"/>
+          <w:b w:val="false"/>
+          <w:bCs w:val="false"/>
+          <w:i w:val="false"/>
+          <w:iCs w:val="false"/>
+          <w:color w:val="262626"/>
+          <w:sz w:val="22"/>
+          <w:szCs w:val="22"/>
+        </w:rPr>
+        <w:t xml:space="preserve">t = √(2h / g)     →     d = v</w:t>
+      </w:r>
+      <w:r>
+        <w:rPr>
+          <w:rFonts w:ascii="Calibri" w:cs="Calibri" w:eastAsia="Calibri" w:hAnsi="Calibri"/>
+          <w:b w:val="false"/>
+          <w:bCs w:val="false"/>
+          <w:i w:val="false"/>
+          <w:iCs w:val="false"/>
+          <w:color w:val="262626"/>
+          <w:sz w:val="22"/>
+          <w:szCs w:val="22"/>
+          <w:vertAlign w:val="subscript"/>
+        </w:rPr>
+        <w:t xml:space="preserve">0</w:t>
+      </w:r>
+      <w:r>
+        <w:rPr>
+          <w:rFonts w:ascii="Calibri" w:cs="Calibri" w:eastAsia="Calibri" w:hAnsi="Calibri"/>
+          <w:b w:val="false"/>
+          <w:bCs w:val="false"/>
+          <w:i w:val="false"/>
+          <w:iCs w:val="false"/>
+          <w:color w:val="262626"/>
+          <w:sz w:val="22"/>
+          <w:szCs w:val="22"/>
+        </w:rPr>
+        <w:t xml:space="preserve"> √(2h / g)</w:t>
       </w:r>
     </w:p>
     <w:p>
@@ -441,6 +366,117 @@
           <w:sz w:val="19"/>
           <w:szCs w:val="19"/>
         </w:rPr>
+        <w:t xml:space="preserve">Define every variable. State the sign convention you are using (up positive, a = −g, g = 9.80 m/s² as a magnitude). Then say plainly what this lab actually tests: substituting the calibration v₀ back in gives d = d̄₀√(h/h₀), with no g in it — so what is on trial is the √h scaling law, not the value of g. End with a hypothesis the data can settle.</w:t>
+      </w:r>
+    </w:p>
+    <w:p>
+      <w:pPr>
+        <w:spacing w:after="0" w:before="0" w:line="360"/>
+      </w:pPr>
+      <w:r>
+        <w:rPr>
+          <w:rFonts w:ascii="Calibri" w:cs="Calibri" w:eastAsia="Calibri" w:hAnsi="Calibri"/>
+          <w:b w:val="false"/>
+          <w:bCs w:val="false"/>
+          <w:i w:val="false"/>
+          <w:iCs w:val="false"/>
+          <w:color w:val="262626"/>
+          <w:sz w:val="22"/>
+          <w:szCs w:val="22"/>
+        </w:rPr>
+        <w:t xml:space="preserve"/>
+      </w:r>
+    </w:p>
+    <w:p>
+      <w:pPr>
+        <w:spacing w:after="0" w:before="0" w:line="360"/>
+      </w:pPr>
+      <w:r>
+        <w:rPr>
+          <w:rFonts w:ascii="Calibri" w:cs="Calibri" w:eastAsia="Calibri" w:hAnsi="Calibri"/>
+          <w:b w:val="false"/>
+          <w:bCs w:val="false"/>
+          <w:i w:val="false"/>
+          <w:iCs w:val="false"/>
+          <w:color w:val="262626"/>
+          <w:sz w:val="22"/>
+          <w:szCs w:val="22"/>
+        </w:rPr>
+        <w:t xml:space="preserve"/>
+      </w:r>
+    </w:p>
+    <w:p>
+      <w:pPr>
+        <w:spacing w:after="0" w:before="0" w:line="360"/>
+      </w:pPr>
+      <w:r>
+        <w:rPr>
+          <w:rFonts w:ascii="Calibri" w:cs="Calibri" w:eastAsia="Calibri" w:hAnsi="Calibri"/>
+          <w:b w:val="false"/>
+          <w:bCs w:val="false"/>
+          <w:i w:val="false"/>
+          <w:iCs w:val="false"/>
+          <w:color w:val="262626"/>
+          <w:sz w:val="22"/>
+          <w:szCs w:val="22"/>
+        </w:rPr>
+        <w:t xml:space="preserve"/>
+      </w:r>
+    </w:p>
+    <w:p>
+      <w:pPr>
+        <w:spacing w:after="0" w:before="0" w:line="360"/>
+      </w:pPr>
+      <w:r>
+        <w:rPr>
+          <w:rFonts w:ascii="Calibri" w:cs="Calibri" w:eastAsia="Calibri" w:hAnsi="Calibri"/>
+          <w:b w:val="false"/>
+          <w:bCs w:val="false"/>
+          <w:i w:val="false"/>
+          <w:iCs w:val="false"/>
+          <w:color w:val="262626"/>
+          <w:sz w:val="22"/>
+          <w:szCs w:val="22"/>
+        </w:rPr>
+        <w:t xml:space="preserve"/>
+      </w:r>
+    </w:p>
+    <w:p>
+      <w:pPr>
+        <w:pBdr>
+          <w:bottom w:val="single" w:color="CFE0D6" w:sz="6" w:space="4"/>
+        </w:pBdr>
+        <w:spacing w:after="120" w:before="280"/>
+      </w:pPr>
+      <w:r>
+        <w:rPr>
+          <w:rFonts w:ascii="Calibri" w:cs="Calibri" w:eastAsia="Calibri" w:hAnsi="Calibri"/>
+          <w:b/>
+          <w:bCs/>
+          <w:i w:val="false"/>
+          <w:iCs w:val="false"/>
+          <w:color w:val="1F4E3D"/>
+          <w:sz w:val="26"/>
+          <w:szCs w:val="26"/>
+        </w:rPr>
+        <w:t xml:space="preserve">Experimental: Materials and Setup</w:t>
+      </w:r>
+    </w:p>
+    <w:p>
+      <w:pPr>
+        <w:spacing w:after="160" w:before="0"/>
+      </w:pPr>
+      <w:r>
+        <w:rPr>
+          <w:rFonts w:ascii="Calibri" w:cs="Calibri" w:eastAsia="Calibri" w:hAnsi="Calibri"/>
+          <w:b w:val="false"/>
+          <w:bCs w:val="false"/>
+          <w:i/>
+          <w:iCs/>
+          <w:color w:val="7A7A7A"/>
+          <w:sz w:val="19"/>
+          <w:szCs w:val="19"/>
+        </w:rPr>
         <w:t xml:space="preserve">Prose, not a list. Name the launcher, the ball, the measuring instruments and their precision. Insert your photo of the actual setup AND your own labelled sketch here. Mark on the sketch where h is measured from and to (the END of the launcher, not the shelf) and where d is measured from and to (the plumb point below the launcher end).</w:t>
       </w:r>
     </w:p>
@@ -719,43 +755,7 @@
           <w:sz w:val="19"/>
           <w:szCs w:val="19"/>
         </w:rPr>
-        <w:t xml:space="preserve">Table 1: your calibration trials at the first height — five or more, with the mean and the standard error of the mean. Table 2: every launch height, with predicted distance, mean measured distance, SEM, and percent difference. Number and caption both, give units in the headers, keep significant digits consistent, and refer to each one in your text.</w:t>
-      </w:r>
-    </w:p>
-    <w:p>
-      <w:pPr>
-        <w:spacing w:after="0" w:before="0" w:line="360"/>
-      </w:pPr>
-      <w:r>
-        <w:rPr>
-          <w:rFonts w:ascii="Calibri" w:cs="Calibri" w:eastAsia="Calibri" w:hAnsi="Calibri"/>
-          <w:b w:val="false"/>
-          <w:bCs w:val="false"/>
-          <w:i w:val="false"/>
-          <w:iCs w:val="false"/>
-          <w:color w:val="262626"/>
-          <w:sz w:val="22"/>
-          <w:szCs w:val="22"/>
-        </w:rPr>
-        <w:t xml:space="preserve"/>
-      </w:r>
-    </w:p>
-    <w:p>
-      <w:pPr>
-        <w:spacing w:after="0" w:before="0" w:line="360"/>
-      </w:pPr>
-      <w:r>
-        <w:rPr>
-          <w:rFonts w:ascii="Calibri" w:cs="Calibri" w:eastAsia="Calibri" w:hAnsi="Calibri"/>
-          <w:b w:val="false"/>
-          <w:bCs w:val="false"/>
-          <w:i w:val="false"/>
-          <w:iCs w:val="false"/>
-          <w:color w:val="262626"/>
-          <w:sz w:val="22"/>
-          <w:szCs w:val="22"/>
-        </w:rPr>
-        <w:t xml:space="preserve"/>
+        <w:t xml:space="preserve">Table 1: your calibration trials at the first height — five or more, with the mean and the standard error of the mean. Table 2: every launch height, with predicted distance, mean measured distance, SEM, and percent difference. Number and caption both, give units in the headers, and keep significant digits consistent.</w:t>
       </w:r>
     </w:p>
     <w:p>
@@ -779,6 +779,42 @@
     </w:p>
     <w:p>
       <w:pPr>
+        <w:spacing w:after="160" w:before="0"/>
+      </w:pPr>
+      <w:r>
+        <w:rPr>
+          <w:rFonts w:ascii="Calibri" w:cs="Calibri" w:eastAsia="Calibri" w:hAnsi="Calibri"/>
+          <w:b w:val="false"/>
+          <w:bCs w:val="false"/>
+          <w:i w:val="false"/>
+          <w:iCs w:val="false"/>
+          <w:color w:val="262626"/>
+          <w:sz w:val="22"/>
+          <w:szCs w:val="22"/>
+        </w:rPr>
+        <w:t xml:space="preserve">Table 1 shows ……</w:t>
+      </w:r>
+    </w:p>
+    <w:p>
+      <w:pPr>
+        <w:spacing w:after="160" w:before="0"/>
+      </w:pPr>
+      <w:r>
+        <w:rPr>
+          <w:rFonts w:ascii="Calibri" w:cs="Calibri" w:eastAsia="Calibri" w:hAnsi="Calibri"/>
+          <w:b w:val="false"/>
+          <w:bCs w:val="false"/>
+          <w:i/>
+          <w:iCs/>
+          <w:color w:val="7A7A7A"/>
+          <w:sz w:val="19"/>
+          <w:szCs w:val="19"/>
+        </w:rPr>
+        <w:t xml:space="preserve">That is the pattern every table and figure in this report needs: name it, then say what it shows, before the reader meets it. Write the lead-in for Table 2 and Figure 3 yourself, the same way.</w:t>
+      </w:r>
+    </w:p>
+    <w:p>
+      <w:pPr>
         <w:spacing w:after="180" w:before="0"/>
         <w:jc w:val="center"/>
       </w:pPr>
@@ -798,6 +834,42 @@
     </w:p>
     <w:p>
       <w:pPr>
+        <w:spacing w:after="0" w:before="0" w:line="360"/>
+      </w:pPr>
+      <w:r>
+        <w:rPr>
+          <w:rFonts w:ascii="Calibri" w:cs="Calibri" w:eastAsia="Calibri" w:hAnsi="Calibri"/>
+          <w:b w:val="false"/>
+          <w:bCs w:val="false"/>
+          <w:i w:val="false"/>
+          <w:iCs w:val="false"/>
+          <w:color w:val="262626"/>
+          <w:sz w:val="22"/>
+          <w:szCs w:val="22"/>
+        </w:rPr>
+        <w:t xml:space="preserve"/>
+      </w:r>
+    </w:p>
+    <w:p>
+      <w:pPr>
+        <w:spacing w:after="0" w:before="0" w:line="360"/>
+      </w:pPr>
+      <w:r>
+        <w:rPr>
+          <w:rFonts w:ascii="Calibri" w:cs="Calibri" w:eastAsia="Calibri" w:hAnsi="Calibri"/>
+          <w:b w:val="false"/>
+          <w:bCs w:val="false"/>
+          <w:i w:val="false"/>
+          <w:iCs w:val="false"/>
+          <w:color w:val="262626"/>
+          <w:sz w:val="22"/>
+          <w:szCs w:val="22"/>
+        </w:rPr>
+        <w:t xml:space="preserve"/>
+      </w:r>
+    </w:p>
+    <w:p>
+      <w:pPr>
         <w:spacing w:after="160" w:before="0"/>
       </w:pPr>
       <w:r>
@@ -835,6 +907,42 @@
     </w:p>
     <w:p>
       <w:pPr>
+        <w:spacing w:after="0" w:before="0" w:line="360"/>
+      </w:pPr>
+      <w:r>
+        <w:rPr>
+          <w:rFonts w:ascii="Calibri" w:cs="Calibri" w:eastAsia="Calibri" w:hAnsi="Calibri"/>
+          <w:b w:val="false"/>
+          <w:bCs w:val="false"/>
+          <w:i w:val="false"/>
+          <w:iCs w:val="false"/>
+          <w:color w:val="262626"/>
+          <w:sz w:val="22"/>
+          <w:szCs w:val="22"/>
+        </w:rPr>
+        <w:t xml:space="preserve"/>
+      </w:r>
+    </w:p>
+    <w:p>
+      <w:pPr>
+        <w:spacing w:after="0" w:before="0" w:line="360"/>
+      </w:pPr>
+      <w:r>
+        <w:rPr>
+          <w:rFonts w:ascii="Calibri" w:cs="Calibri" w:eastAsia="Calibri" w:hAnsi="Calibri"/>
+          <w:b w:val="false"/>
+          <w:bCs w:val="false"/>
+          <w:i w:val="false"/>
+          <w:iCs w:val="false"/>
+          <w:color w:val="262626"/>
+          <w:sz w:val="22"/>
+          <w:szCs w:val="22"/>
+        </w:rPr>
+        <w:t xml:space="preserve"/>
+      </w:r>
+    </w:p>
+    <w:p>
+      <w:pPr>
         <w:pBdr>
           <w:bottom w:val="single" w:color="CFE0D6" w:sz="6" w:space="4"/>
         </w:pBdr>
@@ -1170,7 +1278,25 @@
           <w:sz w:val="19"/>
           <w:szCs w:val="19"/>
         </w:rPr>
-        <w:t xml:space="preserve">Open with “we experimentally determined that v₀ = ___ ± ___ m/s”. State whether your hypothesis is confirmed and argue it with the 10% rule. Then do the part that carries the marks: look at the PATTERN in your percent differences across heights, not just their average. Do they trend one way as the height grows? A trend is systematic and means something; say what. State for each height whether the ball landed in the cup, including the times it did not. The phrase “human error” appears nowhere.</w:t>
+        <w:t xml:space="preserve">State whether your hypothesis is confirmed and argue it with the 10% rule. Then do the part that carries the marks: look at the PATTERN in your percent differences across heights, not just their average. Do they trend one way as the height grows? A trend is systematic and means something; say what. State for each height whether the ball landed in the cup, including the times it did not. The phrase "human error" appears nowhere.</w:t>
+      </w:r>
+    </w:p>
+    <w:p>
+      <w:pPr>
+        <w:spacing w:after="160" w:before="0"/>
+      </w:pPr>
+      <w:r>
+        <w:rPr>
+          <w:rFonts w:ascii="Calibri" w:cs="Calibri" w:eastAsia="Calibri" w:hAnsi="Calibri"/>
+          <w:b w:val="false"/>
+          <w:bCs w:val="false"/>
+          <w:i w:val="false"/>
+          <w:iCs w:val="false"/>
+          <w:color w:val="262626"/>
+          <w:sz w:val="22"/>
+          <w:szCs w:val="22"/>
+        </w:rPr>
+        <w:t xml:space="preserve">We experimentally determined that v₀ = ___ ± ___ m/s. This result confirms ……</w:t>
       </w:r>
     </w:p>
     <w:p>
@@ -1353,7 +1479,7 @@
           <w:sz w:val="19"/>
           <w:szCs w:val="19"/>
         </w:rPr>
-        <w:t xml:space="preserve">Answer the handout's discussion questions here, in paragraphs, in a dedicated section. Do not restate the question before answering it.</w:t>
+        <w:t xml:space="preserve">Answer the handout's seven discussion questions here, in paragraphs, in a dedicated section. Do not restate the question before answering it, and do not number them.</w:t>
       </w:r>
     </w:p>
     <w:p>
@@ -1501,6 +1627,24 @@
           <w:szCs w:val="19"/>
         </w:rPr>
         <w:t xml:space="preserve">Three to four sentences. The numerical result with its percent difference; a definitive verified or not-verified statement; one concrete way you would improve the measurement.</w:t>
+      </w:r>
+    </w:p>
+    <w:p>
+      <w:pPr>
+        <w:spacing w:after="160" w:before="0"/>
+      </w:pPr>
+      <w:r>
+        <w:rPr>
+          <w:rFonts w:ascii="Calibri" w:cs="Calibri" w:eastAsia="Calibri" w:hAnsi="Calibri"/>
+          <w:b w:val="false"/>
+          <w:bCs w:val="false"/>
+          <w:i w:val="false"/>
+          <w:iCs w:val="false"/>
+          <w:color w:val="262626"/>
+          <w:sz w:val="22"/>
+          <w:szCs w:val="22"/>
+        </w:rPr>
+        <w:t xml:space="preserve">We therefore verified that ……</w:t>
       </w:r>
     </w:p>
     <w:p>

</xml_diff>